<commit_message>
Add Agent-Ready Lakehouse project; align site title with official title
Co-Authored-By: Claude Opus 5.5 <noreply@anthropic.com>
</commit_message>
<xml_diff>
--- a/Resume/Siddhesh_Amrale_Resume_Data_Platform.docx
+++ b/Resume/Siddhesh_Amrale_Resume_Data_Platform.docx
@@ -514,13 +514,13 @@
         <w:rPr>
           <w:b/>
         </w:rPr>
-        <w:t>Agent-Ready Lakehouse (in progress)</w:t>
+        <w:t>Agent-Ready Lakehouse</w:t>
       </w:r>
       <w:r>
         <w:rPr>
           <w:color w:val="444444"/>
         </w:rPr>
-        <w:t xml:space="preserve"> | Python, MCP, DuckDB, GitHub Actions | github.com/SiddheshAmrale/agent-ready-lakehouse</w:t>
+        <w:t xml:space="preserve"> | Python, MCP, DuckDB, sqlglot, GitHub Actions | github.com/SiddheshAmrale/agent-ready-lakehouse</w:t>
       </w:r>
     </w:p>
     <w:p>
@@ -532,7 +532,7 @@
           <w:b w:val="0"/>
           <w:i w:val="0"/>
         </w:rPr>
-        <w:t>MCP server that lets AI agents query governed lakehouse data through policy-checked tools (column masking, row filters, audit log), with an evaluation suite that gates every change in CI.</w:t>
+        <w:t>MCP server that gives AI agents governed, read-only access to lakehouse data: SQL allow-list, per-role sandboxes with masking and row filters, a locked engine and an audit log. A CI eval gate checks metric accuracy against an independent oracle, 23 attack and out-of-scope requests, and latency (p95 14 ms).</w:t>
       </w:r>
     </w:p>
     <w:p>

</xml_diff>

<commit_message>
Resume and site: add dbt work from Agent-Ready Lakehouse
Co-Authored-By: Claude Opus 5.5 <noreply@anthropic.com>
</commit_message>
<xml_diff>
--- a/Resume/Siddhesh_Amrale_Resume_Data_Platform.docx
+++ b/Resume/Siddhesh_Amrale_Resume_Data_Platform.docx
@@ -98,7 +98,7 @@
         <w:t xml:space="preserve">Data engineering: </w:t>
       </w:r>
       <w:r>
-        <w:t>SQL, Python, PySpark, Apache Spark, Databricks (Lakeflow/DLT, Unity Catalog, Auto Loader, Asset Bundles), Delta Lake, Parquet, DuckDB, Airflow, Snowflake, ETL/ELT, CDC, SCD Type 2, dimensional modeling, data warehousing, data quality, data governance, Power BI</w:t>
+        <w:t>SQL, Python, PySpark, Apache Spark, Databricks (Lakeflow/DLT, Unity Catalog, Auto Loader, Asset Bundles), Delta Lake, Parquet, DuckDB, dbt, Airflow, Snowflake, ETL/ELT, CDC, SCD Type 2, dimensional modeling, data warehousing, data quality, data governance, Power BI</w:t>
       </w:r>
     </w:p>
     <w:p>
@@ -520,7 +520,7 @@
         <w:rPr>
           <w:color w:val="444444"/>
         </w:rPr>
-        <w:t xml:space="preserve"> | Python, MCP, DuckDB, sqlglot, GitHub Actions | github.com/SiddheshAmrale/agent-ready-lakehouse</w:t>
+        <w:t xml:space="preserve"> | Python, MCP, DuckDB, dbt, sqlglot, GitHub Actions | github.com/SiddheshAmrale/agent-ready-lakehouse</w:t>
       </w:r>
     </w:p>
     <w:p>
@@ -532,7 +532,7 @@
           <w:b w:val="0"/>
           <w:i w:val="0"/>
         </w:rPr>
-        <w:t>MCP server that gives AI agents governed, read-only access to lakehouse data: SQL allow-list, per-role sandboxes with masking and row filters, a locked engine and an audit log. A CI eval gate checks metric accuracy against an independent oracle, 23 attack and out-of-scope requests, and latency (p95 14 ms).</w:t>
+        <w:t>MCP server that gives AI agents governed, read-only access to lakehouse data: SQL allow-list, per-role sandboxes with masking and row filters, a locked engine and an audit log; gold layer also built in dbt with 16 data tests. A CI eval gate checks metric accuracy against an independent oracle, 23 attack and out-of-scope requests, and latency.</w:t>
       </w:r>
     </w:p>
     <w:p>

</xml_diff>